<commit_message>
Highlight only True items in red in Part II sample Word and PDF; False items uncolored
</commit_message>
<xml_diff>
--- a/samples/de_thi_mau_chuan.docx
+++ b/samples/de_thi_mau_chuan.docx
@@ -1461,7 +1461,7 @@
           <w:i/>
           <w:sz w:val="24"/>
         </w:rPr>
-        <w:t>Thí sinh trả lời từ câu 1 đến câu 2. Trong mỗi ý a), b), c), d) ở mỗi câu, thí sinh chọn Đúng hoặc Sai. (Đáp án Đúng/Sai được in đậm màu đỏ)</w:t>
+        <w:t>Thí sinh trả lời từ câu 1 đến câu 2. Trong mỗi ý a), b), c), d) ở mỗi câu, thí sinh chọn Đúng hoặc Sai. (Ý Đúng được in đậm màu đỏ, ý Sai không tô màu)</w:t>
       </w:r>
     </w:p>
     <w:p>
@@ -1509,8 +1509,9 @@
       <w:r>
         <w:rPr>
           <w:rFonts w:ascii="Times New Roman" w:hAnsi="Times New Roman"/>
-          <w:b w:val="0"/>
+          <w:b/>
           <w:i w:val="0"/>
+          <w:color w:val="DC2626"/>
           <w:sz w:val="24"/>
         </w:rPr>
         <w:t xml:space="preserve">a) Chi phí cố định khi chưa sản xuất sản phẩm nào (x = 0) là 500 nghìn đồng. </w:t>
@@ -1533,8 +1534,9 @@
       <w:r>
         <w:rPr>
           <w:rFonts w:ascii="Times New Roman" w:hAnsi="Times New Roman"/>
-          <w:b w:val="0"/>
+          <w:b/>
           <w:i w:val="0"/>
+          <w:color w:val="DC2626"/>
           <w:sz w:val="24"/>
         </w:rPr>
         <w:t xml:space="preserve">b) Chi phí biên tại mức sản lượng x = 10 là C'(10) = 100 nghìn đồng. </w:t>
@@ -1566,9 +1568,8 @@
       <w:r>
         <w:rPr>
           <w:rFonts w:ascii="Times New Roman" w:hAnsi="Times New Roman"/>
-          <w:b/>
+          <w:b w:val="0"/>
           <w:i w:val="0"/>
-          <w:color w:val="DC2626"/>
           <w:sz w:val="24"/>
         </w:rPr>
         <w:t>(Sai)</w:t>
@@ -1590,9 +1591,8 @@
       <w:r>
         <w:rPr>
           <w:rFonts w:ascii="Times New Roman" w:hAnsi="Times New Roman"/>
-          <w:b/>
+          <w:b w:val="0"/>
           <w:i w:val="0"/>
-          <w:color w:val="DC2626"/>
           <w:sz w:val="24"/>
         </w:rPr>
         <w:t>(Sai)</w:t>
@@ -1661,8 +1661,9 @@
       <w:r>
         <w:rPr>
           <w:rFonts w:ascii="Times New Roman" w:hAnsi="Times New Roman"/>
-          <w:b w:val="0"/>
+          <w:b/>
           <w:i w:val="0"/>
+          <w:color w:val="DC2626"/>
           <w:sz w:val="24"/>
         </w:rPr>
         <w:t xml:space="preserve">a) Tọa độ trọng tâm G của tam giác ABC là G(1; 1; 2). </w:t>
@@ -1685,11 +1686,12 @@
       <w:r>
         <w:rPr>
           <w:rFonts w:ascii="Times New Roman" w:hAnsi="Times New Roman"/>
-          <w:b w:val="0"/>
+          <w:b/>
           <w:i w:val="0"/>
+          <w:color w:val="DC2626"/>
           <w:sz w:val="24"/>
         </w:rPr>
-        <w:t xml:space="preserve">b) Mặt phẳng (P) có một vectơ pháp tuyến là n⃗ = (2; -1; 2). </w:t>
+        <w:t xml:space="preserve">b) Mặt phẳng (P) có một vectơ pháp tuyến là n = (2; -1; 2). </w:t>
       </w:r>
       <w:r>
         <w:rPr>
@@ -1718,9 +1720,8 @@
       <w:r>
         <w:rPr>
           <w:rFonts w:ascii="Times New Roman" w:hAnsi="Times New Roman"/>
-          <w:b/>
+          <w:b w:val="0"/>
           <w:i w:val="0"/>
-          <w:color w:val="DC2626"/>
           <w:sz w:val="24"/>
         </w:rPr>
         <w:t>(Sai)</w:t>
@@ -1742,9 +1743,8 @@
       <w:r>
         <w:rPr>
           <w:rFonts w:ascii="Times New Roman" w:hAnsi="Times New Roman"/>
-          <w:b/>
+          <w:b w:val="0"/>
           <w:i w:val="0"/>
-          <w:color w:val="DC2626"/>
           <w:sz w:val="24"/>
         </w:rPr>
         <w:t>(Sai)</w:t>

</xml_diff>

<commit_message>
Remove (Dung)/(Sai) text suffix from Part II sample Word and PDF; red color implicitly denotes True
</commit_message>
<xml_diff>
--- a/samples/de_thi_mau_chuan.docx
+++ b/samples/de_thi_mau_chuan.docx
@@ -1514,17 +1514,7 @@
           <w:color w:val="DC2626"/>
           <w:sz w:val="24"/>
         </w:rPr>
-        <w:t xml:space="preserve">a) Chi phí cố định khi chưa sản xuất sản phẩm nào (x = 0) là 500 nghìn đồng. </w:t>
-      </w:r>
-      <w:r>
-        <w:rPr>
-          <w:rFonts w:ascii="Times New Roman" w:hAnsi="Times New Roman"/>
-          <w:b/>
-          <w:i w:val="0"/>
-          <w:color w:val="DC2626"/>
-          <w:sz w:val="24"/>
-        </w:rPr>
-        <w:t>(Đúng)</w:t>
+        <w:t>a) Chi phí cố định khi chưa sản xuất sản phẩm nào (x = 0) là 500 nghìn đồng.</w:t>
       </w:r>
     </w:p>
     <w:p>
@@ -1539,17 +1529,7 @@
           <w:color w:val="DC2626"/>
           <w:sz w:val="24"/>
         </w:rPr>
-        <w:t xml:space="preserve">b) Chi phí biên tại mức sản lượng x = 10 là C'(10) = 100 nghìn đồng. </w:t>
-      </w:r>
-      <w:r>
-        <w:rPr>
-          <w:rFonts w:ascii="Times New Roman" w:hAnsi="Times New Roman"/>
-          <w:b/>
-          <w:i w:val="0"/>
-          <w:color w:val="DC2626"/>
-          <w:sz w:val="24"/>
-        </w:rPr>
-        <w:t>(Đúng)</w:t>
+        <w:t>b) Chi phí biên tại mức sản lượng x = 10 là C'(10) = 100 nghìn đồng.</w:t>
       </w:r>
     </w:p>
     <w:p>
@@ -1563,16 +1543,7 @@
           <w:i w:val="0"/>
           <w:sz w:val="24"/>
         </w:rPr>
-        <w:t xml:space="preserve">c) Chi phí sản xuất trung bình cho mỗi sản phẩm luôn giảm khi số lượng sản phẩm tăng từ 0 đến 25. </w:t>
-      </w:r>
-      <w:r>
-        <w:rPr>
-          <w:rFonts w:ascii="Times New Roman" w:hAnsi="Times New Roman"/>
-          <w:b w:val="0"/>
-          <w:i w:val="0"/>
-          <w:sz w:val="24"/>
-        </w:rPr>
-        <w:t>(Sai)</w:t>
+        <w:t>c) Chi phí sản xuất trung bình cho mỗi sản phẩm luôn giảm khi số lượng sản phẩm tăng từ 0 đến 25.</w:t>
       </w:r>
     </w:p>
     <w:p>
@@ -1586,16 +1557,7 @@
           <w:i w:val="0"/>
           <w:sz w:val="24"/>
         </w:rPr>
-        <w:t xml:space="preserve">d) Tổng chi phí sản xuất đạt giá trị nhỏ nhất khi mức sản lượng x = 20 sản phẩm. </w:t>
-      </w:r>
-      <w:r>
-        <w:rPr>
-          <w:rFonts w:ascii="Times New Roman" w:hAnsi="Times New Roman"/>
-          <w:b w:val="0"/>
-          <w:i w:val="0"/>
-          <w:sz w:val="24"/>
-        </w:rPr>
-        <w:t>(Sai)</w:t>
+        <w:t>d) Tổng chi phí sản xuất đạt giá trị nhỏ nhất khi mức sản lượng x = 20 sản phẩm.</w:t>
       </w:r>
     </w:p>
     <w:p>
@@ -1666,17 +1628,7 @@
           <w:color w:val="DC2626"/>
           <w:sz w:val="24"/>
         </w:rPr>
-        <w:t xml:space="preserve">a) Tọa độ trọng tâm G của tam giác ABC là G(1; 1; 2). </w:t>
-      </w:r>
-      <w:r>
-        <w:rPr>
-          <w:rFonts w:ascii="Times New Roman" w:hAnsi="Times New Roman"/>
-          <w:b/>
-          <w:i w:val="0"/>
-          <w:color w:val="DC2626"/>
-          <w:sz w:val="24"/>
-        </w:rPr>
-        <w:t>(Đúng)</w:t>
+        <w:t>a) Tọa độ trọng tâm G của tam giác ABC là G(1; 1; 2).</w:t>
       </w:r>
     </w:p>
     <w:p>
@@ -1691,17 +1643,7 @@
           <w:color w:val="DC2626"/>
           <w:sz w:val="24"/>
         </w:rPr>
-        <w:t xml:space="preserve">b) Mặt phẳng (P) có một vectơ pháp tuyến là n = (2; -1; 2). </w:t>
-      </w:r>
-      <w:r>
-        <w:rPr>
-          <w:rFonts w:ascii="Times New Roman" w:hAnsi="Times New Roman"/>
-          <w:b/>
-          <w:i w:val="0"/>
-          <w:color w:val="DC2626"/>
-          <w:sz w:val="24"/>
-        </w:rPr>
-        <w:t>(Đúng)</w:t>
+        <w:t>b) Mặt phẳng (P) có một vectơ pháp tuyến là n = (2; -1; 2).</w:t>
       </w:r>
     </w:p>
     <w:p>
@@ -1715,16 +1657,7 @@
           <w:i w:val="0"/>
           <w:sz w:val="24"/>
         </w:rPr>
-        <w:t xml:space="preserve">c) Điểm A(1; 0; 2) nằm trên mặt phẳng (P). </w:t>
-      </w:r>
-      <w:r>
-        <w:rPr>
-          <w:rFonts w:ascii="Times New Roman" w:hAnsi="Times New Roman"/>
-          <w:b w:val="0"/>
-          <w:i w:val="0"/>
-          <w:sz w:val="24"/>
-        </w:rPr>
-        <w:t>(Sai)</w:t>
+        <w:t>c) Điểm A(1; 0; 2) nằm trên mặt phẳng (P).</w:t>
       </w:r>
     </w:p>
     <w:p>
@@ -1738,16 +1671,7 @@
           <w:i w:val="0"/>
           <w:sz w:val="24"/>
         </w:rPr>
-        <w:t xml:space="preserve">d) Khoảng cách từ gốc tọa độ O đến mặt phẳng (P) bằng 1. </w:t>
-      </w:r>
-      <w:r>
-        <w:rPr>
-          <w:rFonts w:ascii="Times New Roman" w:hAnsi="Times New Roman"/>
-          <w:b w:val="0"/>
-          <w:i w:val="0"/>
-          <w:sz w:val="24"/>
-        </w:rPr>
-        <w:t>(Sai)</w:t>
+        <w:t>d) Khoảng cách từ gốc tọa độ O đến mặt phẳng (P) bằng 1.</w:t>
       </w:r>
     </w:p>
     <w:p>

</xml_diff>

<commit_message>
Fix vector rendering: use native OMML equations and KaTeX \vec syntax to prevent tofu box glyph errors
</commit_message>
<xml_diff>
--- a/samples/de_thi_mau_chuan.docx
+++ b/samples/de_thi_mau_chuan.docx
@@ -1237,15 +1237,23 @@
         </w:rPr>
         <w:t xml:space="preserve">Trong không gian Oxyz, cho hai vectơ </w:t>
       </w:r>
-      <w:r>
-        <w:rPr>
-          <w:rFonts w:ascii="Times New Roman" w:hAnsi="Times New Roman"/>
-          <w:b w:val="0"/>
-          <w:i/>
-          <w:sz w:val="24"/>
-        </w:rPr>
-        <w:t>a⃗ = (1; 2; -1)</w:t>
-      </w:r>
+      <m:oMath>
+        <m:acc>
+          <m:accPr>
+            <m:chr m:val="⃗"/>
+          </m:accPr>
+          <m:e>
+            <m:r>
+              <w:rPr/>
+              <m:t>a</m:t>
+            </m:r>
+          </m:e>
+        </m:acc>
+        <m:r>
+          <w:rPr/>
+          <m:t xml:space="preserve"> = (1; 2; -1)</m:t>
+        </m:r>
+      </m:oMath>
       <w:r>
         <w:rPr>
           <w:rFonts w:ascii="Times New Roman" w:hAnsi="Times New Roman"/>
@@ -1255,15 +1263,23 @@
         </w:rPr>
         <w:t xml:space="preserve"> và </w:t>
       </w:r>
-      <w:r>
-        <w:rPr>
-          <w:rFonts w:ascii="Times New Roman" w:hAnsi="Times New Roman"/>
-          <w:b w:val="0"/>
-          <w:i/>
-          <w:sz w:val="24"/>
-        </w:rPr>
-        <w:t>b⃗ = (2; 0; 1)</w:t>
-      </w:r>
+      <m:oMath>
+        <m:acc>
+          <m:accPr>
+            <m:chr m:val="⃗"/>
+          </m:accPr>
+          <m:e>
+            <m:r>
+              <w:rPr/>
+              <m:t>b</m:t>
+            </m:r>
+          </m:e>
+        </m:acc>
+        <m:r>
+          <w:rPr/>
+          <m:t xml:space="preserve"> = (2; 0; 1)</m:t>
+        </m:r>
+      </m:oMath>
       <w:r>
         <w:rPr>
           <w:rFonts w:ascii="Times New Roman" w:hAnsi="Times New Roman"/>
@@ -1273,15 +1289,44 @@
         </w:rPr>
         <w:t xml:space="preserve">. Tọa độ của vectơ </w:t>
       </w:r>
-      <w:r>
-        <w:rPr>
-          <w:rFonts w:ascii="Times New Roman" w:hAnsi="Times New Roman"/>
-          <w:b w:val="0"/>
-          <w:i/>
-          <w:sz w:val="24"/>
-        </w:rPr>
-        <w:t>u⃗ = a⃗ + 2b⃗</w:t>
-      </w:r>
+      <m:oMath>
+        <m:acc>
+          <m:accPr>
+            <m:chr m:val="⃗"/>
+          </m:accPr>
+          <m:e>
+            <m:r>
+              <m:t>u</m:t>
+            </m:r>
+          </m:e>
+        </m:acc>
+        <m:r>
+          <m:t xml:space="preserve"> = </m:t>
+        </m:r>
+        <m:acc>
+          <m:accPr>
+            <m:chr m:val="⃗"/>
+          </m:accPr>
+          <m:e>
+            <m:r>
+              <m:t>a</m:t>
+            </m:r>
+          </m:e>
+        </m:acc>
+        <m:r>
+          <m:t xml:space="preserve"> + 2</m:t>
+        </m:r>
+        <m:acc>
+          <m:accPr>
+            <m:chr m:val="⃗"/>
+          </m:accPr>
+          <m:e>
+            <m:r>
+              <m:t>b</m:t>
+            </m:r>
+          </m:e>
+        </m:acc>
+      </m:oMath>
       <w:r>
         <w:rPr>
           <w:rFonts w:ascii="Times New Roman" w:hAnsi="Times New Roman"/>
@@ -1333,16 +1378,29 @@
               </w:rPr>
               <w:t xml:space="preserve">A. </w:t>
             </w:r>
-            <w:r>
-              <w:rPr>
-                <w:rFonts w:ascii="Times New Roman" w:hAnsi="Times New Roman"/>
-                <w:b/>
-                <w:i w:val="0"/>
-                <w:color w:val="DC2626"/>
-                <w:sz w:val="24"/>
-              </w:rPr>
-              <w:t>u⃗ = (5; 2; 1).</w:t>
-            </w:r>
+            <m:oMath>
+              <m:acc>
+                <m:accPr>
+                  <m:chr m:val="⃗"/>
+                </m:accPr>
+                <m:e>
+                  <m:r>
+                    <w:rPr>
+                      <w:color w:val="DC2626"/>
+                      <w:b/>
+                    </w:rPr>
+                    <m:t>u</m:t>
+                  </m:r>
+                </m:e>
+              </m:acc>
+              <m:r>
+                <w:rPr>
+                  <w:color w:val="DC2626"/>
+                  <w:b/>
+                </w:rPr>
+                <m:t xml:space="preserve"> = (5; 2; 1).</m:t>
+              </m:r>
+            </m:oMath>
           </w:p>
         </w:tc>
         <w:tc>
@@ -1362,15 +1420,23 @@
               </w:rPr>
               <w:t xml:space="preserve">B. </w:t>
             </w:r>
-            <w:r>
-              <w:rPr>
-                <w:rFonts w:ascii="Times New Roman" w:hAnsi="Times New Roman"/>
-                <w:b w:val="0"/>
-                <w:i w:val="0"/>
-                <w:sz w:val="24"/>
-              </w:rPr>
-              <w:t>u⃗ = (3; 2; 0).</w:t>
-            </w:r>
+            <m:oMath>
+              <m:acc>
+                <m:accPr>
+                  <m:chr m:val="⃗"/>
+                </m:accPr>
+                <m:e>
+                  <m:r>
+                    <w:rPr/>
+                    <m:t>u</m:t>
+                  </m:r>
+                </m:e>
+              </m:acc>
+              <m:r>
+                <w:rPr/>
+                <m:t xml:space="preserve"> = (3; 2; 0).</m:t>
+              </m:r>
+            </m:oMath>
           </w:p>
         </w:tc>
       </w:tr>
@@ -1395,15 +1461,23 @@
               </w:rPr>
               <w:t xml:space="preserve">C. </w:t>
             </w:r>
-            <w:r>
-              <w:rPr>
-                <w:rFonts w:ascii="Times New Roman" w:hAnsi="Times New Roman"/>
-                <w:b w:val="0"/>
-                <w:i w:val="0"/>
-                <w:sz w:val="24"/>
-              </w:rPr>
-              <w:t>u⃗ = (5; 4; 1).</w:t>
-            </w:r>
+            <m:oMath>
+              <m:acc>
+                <m:accPr>
+                  <m:chr m:val="⃗"/>
+                </m:accPr>
+                <m:e>
+                  <m:r>
+                    <w:rPr/>
+                    <m:t>u</m:t>
+                  </m:r>
+                </m:e>
+              </m:acc>
+              <m:r>
+                <w:rPr/>
+                <m:t xml:space="preserve"> = (5; 4; 1).</m:t>
+              </m:r>
+            </m:oMath>
           </w:p>
         </w:tc>
         <w:tc>
@@ -1423,15 +1497,23 @@
               </w:rPr>
               <w:t xml:space="preserve">D. </w:t>
             </w:r>
-            <w:r>
-              <w:rPr>
-                <w:rFonts w:ascii="Times New Roman" w:hAnsi="Times New Roman"/>
-                <w:b w:val="0"/>
-                <w:i w:val="0"/>
-                <w:sz w:val="24"/>
-              </w:rPr>
-              <w:t>u⃗ = (4; 2; -1).</w:t>
-            </w:r>
+            <m:oMath>
+              <m:acc>
+                <m:accPr>
+                  <m:chr m:val="⃗"/>
+                </m:accPr>
+                <m:e>
+                  <m:r>
+                    <w:rPr/>
+                    <m:t>u</m:t>
+                  </m:r>
+                </m:e>
+              </m:acc>
+              <m:r>
+                <w:rPr/>
+                <m:t xml:space="preserve"> = (4; 2; -1).</m:t>
+              </m:r>
+            </m:oMath>
           </w:p>
         </w:tc>
       </w:tr>

</xml_diff>